<commit_message>
modified:   HW1.docx 	modified:   README.md 	new file:   plots/fft_mops.png 	new file:   plots/n2_mops.png 	modified:   requirements.txt 	modified:   runs/ec2_results.csv 	modified:   runs/ece_results.csv 	new file:   runs/fft_table.csv 	modified:   runs/merged_results.csv 	new file:   runs/n2_table.csv 	new file:   src/__pycache__/merge_results.cpython-312.pyc 	new file:   src/__pycache__/plot_results.cpython-312.pyc 	modified:   src/main.py 	modified:   src/merge_results.py 	modified:   src/multiplication.py 	new file:   src/plot_results.py 	modified:   src/utils.py 	modified:   src/verify.py 	new file:   ~$template-hw1.xlsx
</commit_message>
<xml_diff>
--- a/HW1.docx
+++ b/HW1.docx
@@ -963,7 +963,6 @@
           <w:spacing w:val="0"/>
           <w:sz w:val="24"/>
           <w:szCs w:val="24"/>
-          <w:bdr w:val="none" w:color="auto" w:sz="0" w:space="0"/>
           <w:shd w:val="clear" w:fill="FFFFFF"/>
         </w:rPr>
         <w:t>An ECE number cluster machine: ece0XX.ece.local.cmu.edu</w:t>
@@ -978,7 +977,6 @@
           <w:spacing w:val="0"/>
           <w:sz w:val="24"/>
           <w:szCs w:val="24"/>
-          <w:bdr w:val="none" w:color="auto" w:sz="0" w:space="0"/>
           <w:shd w:val="clear" w:fill="FFFFFF"/>
         </w:rPr>
         <w:br w:type="textWrapping"/>
@@ -994,7 +992,6 @@
           <w:sz w:val="24"/>
           <w:szCs w:val="24"/>
           <w:u w:val="single"/>
-          <w:bdr w:val="none" w:color="auto" w:sz="0" w:space="0"/>
           <w:shd w:val="clear" w:fill="FFFFFF"/>
         </w:rPr>
         <w:fldChar w:fldCharType="begin"/>
@@ -1010,7 +1007,6 @@
           <w:sz w:val="24"/>
           <w:szCs w:val="24"/>
           <w:u w:val="single"/>
-          <w:bdr w:val="none" w:color="auto" w:sz="0" w:space="0"/>
           <w:shd w:val="clear" w:fill="FFFFFF"/>
         </w:rPr>
         <w:instrText xml:space="preserve"> HYPERLINK "https://cmu-enterprise.atlassian.net/wiki/spaces/ITS/pages/2332131370/ECE+Community+Compute+Clusters" \t "https://canvas.cmu.edu/courses/54903/assignments/_blank" </w:instrText>
@@ -1026,14 +1022,13 @@
           <w:sz w:val="24"/>
           <w:szCs w:val="24"/>
           <w:u w:val="single"/>
-          <w:bdr w:val="none" w:color="auto" w:sz="0" w:space="0"/>
           <w:shd w:val="clear" w:fill="FFFFFF"/>
         </w:rPr>
         <w:fldChar w:fldCharType="separate"/>
       </w:r>
       <w:r>
         <w:rPr>
-          <w:rStyle w:val="7"/>
+          <w:rStyle w:val="8"/>
           <w:rFonts w:hint="default" w:ascii="Helvetica" w:hAnsi="Helvetica" w:eastAsia="Helvetica" w:cs="Helvetica"/>
           <w:i w:val="0"/>
           <w:iCs w:val="0"/>
@@ -1043,7 +1038,6 @@
           <w:sz w:val="24"/>
           <w:szCs w:val="24"/>
           <w:u w:val="single"/>
-          <w:bdr w:val="none" w:color="auto" w:sz="0" w:space="0"/>
           <w:shd w:val="clear" w:fill="FFFFFF"/>
         </w:rPr>
         <w:t>https://cmu-enterprise.atlassian.net/wiki/spaces/ITS/pages/2332131370/ECE+Community+Compute+ClustersLinks to an external site.</w:t>
@@ -1059,7 +1053,6 @@
           <w:sz w:val="24"/>
           <w:szCs w:val="24"/>
           <w:u w:val="single"/>
-          <w:bdr w:val="none" w:color="auto" w:sz="0" w:space="0"/>
           <w:shd w:val="clear" w:fill="FFFFFF"/>
         </w:rPr>
         <w:fldChar w:fldCharType="end"/>
@@ -1074,7 +1067,6 @@
           <w:spacing w:val="0"/>
           <w:sz w:val="24"/>
           <w:szCs w:val="24"/>
-          <w:bdr w:val="none" w:color="auto" w:sz="0" w:space="0"/>
           <w:shd w:val="clear" w:fill="FFFFFF"/>
         </w:rPr>
         <w:t> </w:t>
@@ -1103,7 +1095,6 @@
           <w:spacing w:val="0"/>
           <w:sz w:val="24"/>
           <w:szCs w:val="24"/>
-          <w:bdr w:val="none" w:color="auto" w:sz="0" w:space="0"/>
           <w:shd w:val="clear" w:fill="FFFFFF"/>
         </w:rPr>
         <w:t>An AWS instance of your choice with </w:t>
@@ -1118,7 +1109,6 @@
           <w:spacing w:val="0"/>
           <w:sz w:val="24"/>
           <w:szCs w:val="24"/>
-          <w:bdr w:val="none" w:color="auto" w:sz="0" w:space="0"/>
           <w:shd w:val="clear" w:fill="FFFFFF"/>
         </w:rPr>
         <w:t>one</w:t>
@@ -1133,7 +1123,6 @@
           <w:spacing w:val="0"/>
           <w:sz w:val="24"/>
           <w:szCs w:val="24"/>
-          <w:bdr w:val="none" w:color="auto" w:sz="0" w:space="0"/>
           <w:shd w:val="clear" w:fill="FFFFFF"/>
         </w:rPr>
         <w:t> vCPU (hint: memory may become an issue as the integers get larger)</w:t>
@@ -1148,7 +1137,6 @@
           <w:spacing w:val="0"/>
           <w:sz w:val="24"/>
           <w:szCs w:val="24"/>
-          <w:bdr w:val="none" w:color="auto" w:sz="0" w:space="0"/>
           <w:shd w:val="clear" w:fill="FFFFFF"/>
         </w:rPr>
         <w:br w:type="textWrapping"/>
@@ -1164,7 +1152,6 @@
           <w:sz w:val="24"/>
           <w:szCs w:val="24"/>
           <w:u w:val="single"/>
-          <w:bdr w:val="none" w:color="auto" w:sz="0" w:space="0"/>
           <w:shd w:val="clear" w:fill="FFFFFF"/>
         </w:rPr>
         <w:fldChar w:fldCharType="begin"/>
@@ -1180,7 +1167,6 @@
           <w:sz w:val="24"/>
           <w:szCs w:val="24"/>
           <w:u w:val="single"/>
-          <w:bdr w:val="none" w:color="auto" w:sz="0" w:space="0"/>
           <w:shd w:val="clear" w:fill="FFFFFF"/>
         </w:rPr>
         <w:instrText xml:space="preserve"> HYPERLINK "https://aws.amazon.com/ec2/instance-types/" \t "https://canvas.cmu.edu/courses/54903/assignments/_blank" </w:instrText>
@@ -1196,14 +1182,13 @@
           <w:sz w:val="24"/>
           <w:szCs w:val="24"/>
           <w:u w:val="single"/>
-          <w:bdr w:val="none" w:color="auto" w:sz="0" w:space="0"/>
           <w:shd w:val="clear" w:fill="FFFFFF"/>
         </w:rPr>
         <w:fldChar w:fldCharType="separate"/>
       </w:r>
       <w:r>
         <w:rPr>
-          <w:rStyle w:val="7"/>
+          <w:rStyle w:val="8"/>
           <w:rFonts w:hint="default" w:ascii="Helvetica" w:hAnsi="Helvetica" w:eastAsia="Helvetica" w:cs="Helvetica"/>
           <w:i w:val="0"/>
           <w:iCs w:val="0"/>
@@ -1213,7 +1198,6 @@
           <w:sz w:val="24"/>
           <w:szCs w:val="24"/>
           <w:u w:val="single"/>
-          <w:bdr w:val="none" w:color="auto" w:sz="0" w:space="0"/>
           <w:shd w:val="clear" w:fill="FFFFFF"/>
         </w:rPr>
         <w:t>https://aws.amazon.com/ec2/instance-types/Links to an external site.</w:t>
@@ -1229,7 +1213,6 @@
           <w:sz w:val="24"/>
           <w:szCs w:val="24"/>
           <w:u w:val="single"/>
-          <w:bdr w:val="none" w:color="auto" w:sz="0" w:space="0"/>
           <w:shd w:val="clear" w:fill="FFFFFF"/>
         </w:rPr>
         <w:fldChar w:fldCharType="end"/>
@@ -1350,7 +1333,6 @@
           <w:spacing w:val="0"/>
           <w:sz w:val="24"/>
           <w:szCs w:val="24"/>
-          <w:bdr w:val="none" w:color="auto" w:sz="0" w:space="0"/>
           <w:shd w:val="clear" w:fill="FFFFFF"/>
         </w:rPr>
         <w:t>Input:</w:t>
@@ -1365,7 +1347,6 @@
           <w:spacing w:val="0"/>
           <w:sz w:val="24"/>
           <w:szCs w:val="24"/>
-          <w:bdr w:val="none" w:color="auto" w:sz="0" w:space="0"/>
           <w:shd w:val="clear" w:fill="FFFFFF"/>
         </w:rPr>
         <w:t>  Two arbitrary long strings of digits ‘0’ to ‘9’. </w:t>
@@ -1405,7 +1386,6 @@
           <w:spacing w:val="0"/>
           <w:sz w:val="24"/>
           <w:szCs w:val="24"/>
-          <w:bdr w:val="none" w:color="auto" w:sz="0" w:space="0"/>
           <w:shd w:val="clear" w:fill="FFFFFF"/>
         </w:rPr>
         <w:t>Output:</w:t>
@@ -1420,7 +1400,6 @@
           <w:spacing w:val="0"/>
           <w:sz w:val="24"/>
           <w:szCs w:val="24"/>
-          <w:bdr w:val="none" w:color="auto" w:sz="0" w:space="0"/>
           <w:shd w:val="clear" w:fill="FFFFFF"/>
         </w:rPr>
         <w:t> A string of digits ‘0’ to ‘9’ representing the product of the two strings interpreted as base-10 numbers. </w:t>
@@ -1488,7 +1467,6 @@
           <w:spacing w:val="0"/>
           <w:sz w:val="24"/>
           <w:szCs w:val="24"/>
-          <w:bdr w:val="none" w:color="auto" w:sz="0" w:space="0"/>
           <w:shd w:val="clear" w:fill="FFFFFF"/>
         </w:rPr>
         <w:t>O(</w:t>
@@ -1506,7 +1484,6 @@
           <w:spacing w:val="0"/>
           <w:sz w:val="24"/>
           <w:szCs w:val="24"/>
-          <w:bdr w:val="none" w:color="auto" w:sz="0" w:space="0"/>
           <w:shd w:val="clear" w:fill="FFFFFF"/>
         </w:rPr>
         <w:t>n</w:t>
@@ -1524,7 +1501,6 @@
           <w:spacing w:val="0"/>
           <w:sz w:val="18"/>
           <w:szCs w:val="18"/>
-          <w:bdr w:val="none" w:color="auto" w:sz="0" w:space="0"/>
           <w:shd w:val="clear" w:fill="FFFFFF"/>
           <w:vertAlign w:val="baseline"/>
         </w:rPr>
@@ -1543,7 +1519,6 @@
           <w:spacing w:val="0"/>
           <w:sz w:val="24"/>
           <w:szCs w:val="24"/>
-          <w:bdr w:val="none" w:color="auto" w:sz="0" w:space="0"/>
           <w:shd w:val="clear" w:fill="FFFFFF"/>
         </w:rPr>
         <w:t>) algorithm. </w:t>
@@ -1558,7 +1533,6 @@
           <w:spacing w:val="0"/>
           <w:sz w:val="24"/>
           <w:szCs w:val="24"/>
-          <w:bdr w:val="none" w:color="auto" w:sz="0" w:space="0"/>
           <w:shd w:val="clear" w:fill="FFFFFF"/>
         </w:rPr>
         <w:t>Use the highest level control flow constructs available in the language (loops, map/reduce, recursion) to implement the integer multiplication concisely. Do not use built-in multi-precision multiplication or just a multiplication library call. Implement the algorithm iteratively or recursively. Aim for the shortest/cleanest implementation in your chosen language, and make use of well-supported data types and system libraries.</w:t>
@@ -1590,7 +1564,6 @@
           <w:spacing w:val="0"/>
           <w:sz w:val="24"/>
           <w:szCs w:val="24"/>
-          <w:bdr w:val="none" w:color="auto" w:sz="0" w:space="0"/>
           <w:shd w:val="clear" w:fill="FFFFFF"/>
         </w:rPr>
         <w:t>FFT based O(</w:t>
@@ -1608,7 +1581,6 @@
           <w:spacing w:val="0"/>
           <w:sz w:val="24"/>
           <w:szCs w:val="24"/>
-          <w:bdr w:val="none" w:color="auto" w:sz="0" w:space="0"/>
           <w:shd w:val="clear" w:fill="FFFFFF"/>
         </w:rPr>
         <w:t>n</w:t>
@@ -1626,7 +1598,6 @@
           <w:spacing w:val="0"/>
           <w:sz w:val="24"/>
           <w:szCs w:val="24"/>
-          <w:bdr w:val="none" w:color="auto" w:sz="0" w:space="0"/>
           <w:shd w:val="clear" w:fill="FFFFFF"/>
         </w:rPr>
         <w:t> log</w:t>
@@ -1644,7 +1615,6 @@
           <w:spacing w:val="0"/>
           <w:sz w:val="18"/>
           <w:szCs w:val="18"/>
-          <w:bdr w:val="none" w:color="auto" w:sz="0" w:space="0"/>
           <w:shd w:val="clear" w:fill="FFFFFF"/>
           <w:vertAlign w:val="baseline"/>
         </w:rPr>
@@ -1663,7 +1633,6 @@
           <w:spacing w:val="0"/>
           <w:sz w:val="24"/>
           <w:szCs w:val="24"/>
-          <w:bdr w:val="none" w:color="auto" w:sz="0" w:space="0"/>
           <w:shd w:val="clear" w:fill="FFFFFF"/>
         </w:rPr>
         <w:t> </w:t>
@@ -1681,7 +1650,6 @@
           <w:spacing w:val="0"/>
           <w:sz w:val="24"/>
           <w:szCs w:val="24"/>
-          <w:bdr w:val="none" w:color="auto" w:sz="0" w:space="0"/>
           <w:shd w:val="clear" w:fill="FFFFFF"/>
         </w:rPr>
         <w:t>n</w:t>
@@ -1699,7 +1667,6 @@
           <w:spacing w:val="0"/>
           <w:sz w:val="24"/>
           <w:szCs w:val="24"/>
-          <w:bdr w:val="none" w:color="auto" w:sz="0" w:space="0"/>
           <w:shd w:val="clear" w:fill="FFFFFF"/>
         </w:rPr>
         <w:t>) algorithm. </w:t>
@@ -1714,7 +1681,6 @@
           <w:spacing w:val="0"/>
           <w:sz w:val="24"/>
           <w:szCs w:val="24"/>
-          <w:bdr w:val="none" w:color="auto" w:sz="0" w:space="0"/>
           <w:shd w:val="clear" w:fill="FFFFFF"/>
         </w:rPr>
         <w:t>Integer multiplication can be seen as convolution. Through zero padding non-periodic signals can be convolved via FFT (see </w:t>
@@ -1729,7 +1695,6 @@
           <w:spacing w:val="0"/>
           <w:sz w:val="24"/>
           <w:szCs w:val="24"/>
-          <w:bdr w:val="none" w:color="auto" w:sz="0" w:space="0"/>
           <w:shd w:val="clear" w:fill="FFFFFF"/>
         </w:rPr>
         <w:t>Signals and Systems</w:t>
@@ -1744,7 +1709,6 @@
           <w:spacing w:val="0"/>
           <w:sz w:val="24"/>
           <w:szCs w:val="24"/>
-          <w:bdr w:val="none" w:color="auto" w:sz="0" w:space="0"/>
           <w:shd w:val="clear" w:fill="FFFFFF"/>
         </w:rPr>
         <w:t>). Use FFT library calls to implement integer multiplication in O(</w:t>
@@ -1759,7 +1723,6 @@
           <w:spacing w:val="0"/>
           <w:sz w:val="24"/>
           <w:szCs w:val="24"/>
-          <w:bdr w:val="none" w:color="auto" w:sz="0" w:space="0"/>
           <w:shd w:val="clear" w:fill="FFFFFF"/>
         </w:rPr>
         <w:t>n</w:t>
@@ -1774,7 +1737,6 @@
           <w:spacing w:val="0"/>
           <w:sz w:val="24"/>
           <w:szCs w:val="24"/>
-          <w:bdr w:val="none" w:color="auto" w:sz="0" w:space="0"/>
           <w:shd w:val="clear" w:fill="FFFFFF"/>
         </w:rPr>
         <w:t> log</w:t>
@@ -1789,7 +1751,6 @@
           <w:spacing w:val="0"/>
           <w:sz w:val="18"/>
           <w:szCs w:val="18"/>
-          <w:bdr w:val="none" w:color="auto" w:sz="0" w:space="0"/>
           <w:shd w:val="clear" w:fill="FFFFFF"/>
           <w:vertAlign w:val="baseline"/>
         </w:rPr>
@@ -1805,7 +1766,6 @@
           <w:spacing w:val="0"/>
           <w:sz w:val="24"/>
           <w:szCs w:val="24"/>
-          <w:bdr w:val="none" w:color="auto" w:sz="0" w:space="0"/>
           <w:shd w:val="clear" w:fill="FFFFFF"/>
         </w:rPr>
         <w:t> </w:t>
@@ -1820,7 +1780,6 @@
           <w:spacing w:val="0"/>
           <w:sz w:val="24"/>
           <w:szCs w:val="24"/>
-          <w:bdr w:val="none" w:color="auto" w:sz="0" w:space="0"/>
           <w:shd w:val="clear" w:fill="FFFFFF"/>
         </w:rPr>
         <w:t>n</w:t>
@@ -1835,7 +1794,6 @@
           <w:spacing w:val="0"/>
           <w:sz w:val="24"/>
           <w:szCs w:val="24"/>
-          <w:bdr w:val="none" w:color="auto" w:sz="0" w:space="0"/>
           <w:shd w:val="clear" w:fill="FFFFFF"/>
         </w:rPr>
         <w:t>). The details will vary considerably across languages, and some languages may not have FFT as part of their standard library. In this case any third party FFT library is ok.</w:t>
@@ -1917,14 +1875,13 @@
           <w:spacing w:val="0"/>
           <w:sz w:val="24"/>
           <w:szCs w:val="24"/>
-          <w:bdr w:val="none" w:color="auto" w:sz="0" w:space="0"/>
           <w:shd w:val="clear" w:fill="FFFFFF"/>
         </w:rPr>
         <w:t>Measure runtime in seconds as function of problem size, using the tools the language provides (</w:t>
       </w:r>
       <w:r>
         <w:rPr>
-          <w:rStyle w:val="8"/>
+          <w:rStyle w:val="9"/>
           <w:rFonts w:hint="default" w:ascii="Consolas" w:hAnsi="Consolas" w:eastAsia="Consolas" w:cs="Consolas"/>
           <w:i w:val="0"/>
           <w:iCs w:val="0"/>
@@ -1933,7 +1890,6 @@
           <w:spacing w:val="0"/>
           <w:sz w:val="24"/>
           <w:szCs w:val="24"/>
-          <w:bdr w:val="none" w:color="auto" w:sz="0" w:space="0"/>
           <w:shd w:val="clear" w:fill="F2F4F4"/>
         </w:rPr>
         <w:t>gettimeofday()</w:t>
@@ -1948,14 +1904,13 @@
           <w:spacing w:val="0"/>
           <w:sz w:val="24"/>
           <w:szCs w:val="24"/>
-          <w:bdr w:val="none" w:color="auto" w:sz="0" w:space="0"/>
           <w:shd w:val="clear" w:fill="FFFFFF"/>
         </w:rPr>
         <w:t> in C/C++, time in Fortran, </w:t>
       </w:r>
       <w:r>
         <w:rPr>
-          <w:rStyle w:val="8"/>
+          <w:rStyle w:val="9"/>
           <w:rFonts w:hint="default" w:ascii="Consolas" w:hAnsi="Consolas" w:eastAsia="Consolas" w:cs="Consolas"/>
           <w:i w:val="0"/>
           <w:iCs w:val="0"/>
@@ -1964,7 +1919,6 @@
           <w:spacing w:val="0"/>
           <w:sz w:val="24"/>
           <w:szCs w:val="24"/>
-          <w:bdr w:val="none" w:color="auto" w:sz="0" w:space="0"/>
           <w:shd w:val="clear" w:fill="F2F4F4"/>
         </w:rPr>
         <w:t>System.currentTimeinMillis()</w:t>
@@ -1979,14 +1933,13 @@
           <w:spacing w:val="0"/>
           <w:sz w:val="24"/>
           <w:szCs w:val="24"/>
-          <w:bdr w:val="none" w:color="auto" w:sz="0" w:space="0"/>
           <w:shd w:val="clear" w:fill="FFFFFF"/>
         </w:rPr>
         <w:t> in Java, </w:t>
       </w:r>
       <w:r>
         <w:rPr>
-          <w:rStyle w:val="8"/>
+          <w:rStyle w:val="9"/>
           <w:rFonts w:hint="default" w:ascii="Consolas" w:hAnsi="Consolas" w:eastAsia="Consolas" w:cs="Consolas"/>
           <w:i w:val="0"/>
           <w:iCs w:val="0"/>
@@ -1995,7 +1948,6 @@
           <w:spacing w:val="0"/>
           <w:sz w:val="24"/>
           <w:szCs w:val="24"/>
-          <w:bdr w:val="none" w:color="auto" w:sz="0" w:space="0"/>
           <w:shd w:val="clear" w:fill="F2F4F4"/>
         </w:rPr>
         <w:t>tic/toc</w:t>
@@ -2010,14 +1962,13 @@
           <w:spacing w:val="0"/>
           <w:sz w:val="24"/>
           <w:szCs w:val="24"/>
-          <w:bdr w:val="none" w:color="auto" w:sz="0" w:space="0"/>
           <w:shd w:val="clear" w:fill="FFFFFF"/>
         </w:rPr>
         <w:t> in Matlab, </w:t>
       </w:r>
       <w:r>
         <w:rPr>
-          <w:rStyle w:val="8"/>
+          <w:rStyle w:val="9"/>
           <w:rFonts w:hint="default" w:ascii="Consolas" w:hAnsi="Consolas" w:eastAsia="Consolas" w:cs="Consolas"/>
           <w:i w:val="0"/>
           <w:iCs w:val="0"/>
@@ -2026,7 +1977,6 @@
           <w:spacing w:val="0"/>
           <w:sz w:val="24"/>
           <w:szCs w:val="24"/>
-          <w:bdr w:val="none" w:color="auto" w:sz="0" w:space="0"/>
           <w:shd w:val="clear" w:fill="F2F4F4"/>
         </w:rPr>
         <w:t>time.time()</w:t>
@@ -2041,14 +1991,13 @@
           <w:spacing w:val="0"/>
           <w:sz w:val="24"/>
           <w:szCs w:val="24"/>
-          <w:bdr w:val="none" w:color="auto" w:sz="0" w:space="0"/>
           <w:shd w:val="clear" w:fill="FFFFFF"/>
         </w:rPr>
         <w:t> in Python, </w:t>
       </w:r>
       <w:r>
         <w:rPr>
-          <w:rStyle w:val="8"/>
+          <w:rStyle w:val="9"/>
           <w:rFonts w:hint="default" w:ascii="Consolas" w:hAnsi="Consolas" w:eastAsia="Consolas" w:cs="Consolas"/>
           <w:i w:val="0"/>
           <w:iCs w:val="0"/>
@@ -2057,7 +2006,6 @@
           <w:spacing w:val="0"/>
           <w:sz w:val="24"/>
           <w:szCs w:val="24"/>
-          <w:bdr w:val="none" w:color="auto" w:sz="0" w:space="0"/>
           <w:shd w:val="clear" w:fill="F2F4F4"/>
         </w:rPr>
         <w:t>tic()/toc()</w:t>
@@ -2072,7 +2020,6 @@
           <w:spacing w:val="0"/>
           <w:sz w:val="24"/>
           <w:szCs w:val="24"/>
-          <w:bdr w:val="none" w:color="auto" w:sz="0" w:space="0"/>
           <w:shd w:val="clear" w:fill="FFFFFF"/>
         </w:rPr>
         <w:t> in Julia, etc.). </w:t>
@@ -2101,7 +2048,6 @@
           <w:spacing w:val="0"/>
           <w:sz w:val="24"/>
           <w:szCs w:val="24"/>
-          <w:bdr w:val="none" w:color="auto" w:sz="0" w:space="0"/>
           <w:shd w:val="clear" w:fill="FFFFFF"/>
         </w:rPr>
         <w:t>Derive the approximate operation count (number of additions and multiplications of data elements) for your multiplication implementations as a function of string length. Assume that the FFT has 5 </w:t>
@@ -2116,7 +2062,6 @@
           <w:spacing w:val="0"/>
           <w:sz w:val="24"/>
           <w:szCs w:val="24"/>
-          <w:bdr w:val="none" w:color="auto" w:sz="0" w:space="0"/>
           <w:shd w:val="clear" w:fill="FFFFFF"/>
         </w:rPr>
         <w:t>N</w:t>
@@ -2131,7 +2076,6 @@
           <w:spacing w:val="0"/>
           <w:sz w:val="24"/>
           <w:szCs w:val="24"/>
-          <w:bdr w:val="none" w:color="auto" w:sz="0" w:space="0"/>
           <w:shd w:val="clear" w:fill="FFFFFF"/>
         </w:rPr>
         <w:t> log</w:t>
@@ -2146,7 +2090,6 @@
           <w:spacing w:val="0"/>
           <w:sz w:val="18"/>
           <w:szCs w:val="18"/>
-          <w:bdr w:val="none" w:color="auto" w:sz="0" w:space="0"/>
           <w:shd w:val="clear" w:fill="FFFFFF"/>
           <w:vertAlign w:val="baseline"/>
         </w:rPr>
@@ -2162,7 +2105,6 @@
           <w:spacing w:val="0"/>
           <w:sz w:val="24"/>
           <w:szCs w:val="24"/>
-          <w:bdr w:val="none" w:color="auto" w:sz="0" w:space="0"/>
           <w:shd w:val="clear" w:fill="FFFFFF"/>
         </w:rPr>
         <w:t> </w:t>
@@ -2177,7 +2119,6 @@
           <w:spacing w:val="0"/>
           <w:sz w:val="24"/>
           <w:szCs w:val="24"/>
-          <w:bdr w:val="none" w:color="auto" w:sz="0" w:space="0"/>
           <w:shd w:val="clear" w:fill="FFFFFF"/>
         </w:rPr>
         <w:t>N</w:t>
@@ -2192,10 +2133,25 @@
           <w:spacing w:val="0"/>
           <w:sz w:val="24"/>
           <w:szCs w:val="24"/>
-          <w:bdr w:val="none" w:color="auto" w:sz="0" w:space="0"/>
-          <w:shd w:val="clear" w:fill="FFFFFF"/>
-        </w:rPr>
-        <w:t> operations.</w:t>
+          <w:shd w:val="clear" w:fill="FFFFFF"/>
+        </w:rPr>
+        <w:t> op</w:t>
+      </w:r>
+      <w:bookmarkStart w:id="0" w:name="_GoBack"/>
+      <w:bookmarkEnd w:id="0"/>
+      <w:r>
+        <w:rPr>
+          <w:rFonts w:hint="default" w:ascii="Helvetica" w:hAnsi="Helvetica" w:eastAsia="Helvetica" w:cs="Helvetica"/>
+          <w:i w:val="0"/>
+          <w:iCs w:val="0"/>
+          <w:caps w:val="0"/>
+          <w:color w:val="000000"/>
+          <w:spacing w:val="0"/>
+          <w:sz w:val="24"/>
+          <w:szCs w:val="24"/>
+          <w:shd w:val="clear" w:fill="FFFFFF"/>
+        </w:rPr>
+        <w:t>erations.</w:t>
       </w:r>
     </w:p>
     <w:p>
@@ -2514,7 +2470,6 @@
           <w:spacing w:val="0"/>
           <w:sz w:val="24"/>
           <w:szCs w:val="24"/>
-          <w:bdr w:val="none" w:color="auto" w:sz="0" w:space="0"/>
           <w:shd w:val="clear" w:fill="FFFFFF"/>
         </w:rPr>
         <w:t>Implement an accelerated FFT-based algorithm in CUDA using cuFFT and measure the algorithm’s performance there and plot it using our template. (Other accelerator paradigms are acceptable, but CUDA is the standard)</w:t>
@@ -2543,7 +2498,6 @@
           <w:spacing w:val="0"/>
           <w:sz w:val="24"/>
           <w:szCs w:val="24"/>
-          <w:bdr w:val="none" w:color="auto" w:sz="0" w:space="0"/>
           <w:shd w:val="clear" w:fill="FFFFFF"/>
         </w:rPr>
         <w:t>Explore whether the O(</w:t>
@@ -2558,7 +2512,6 @@
           <w:spacing w:val="0"/>
           <w:sz w:val="24"/>
           <w:szCs w:val="24"/>
-          <w:bdr w:val="none" w:color="auto" w:sz="0" w:space="0"/>
           <w:shd w:val="clear" w:fill="FFFFFF"/>
         </w:rPr>
         <w:t>n</w:t>
@@ -2573,7 +2526,6 @@
           <w:spacing w:val="0"/>
           <w:sz w:val="24"/>
           <w:szCs w:val="24"/>
-          <w:bdr w:val="none" w:color="auto" w:sz="0" w:space="0"/>
           <w:shd w:val="clear" w:fill="FFFFFF"/>
         </w:rPr>
         <w:t> log</w:t>
@@ -2588,7 +2540,6 @@
           <w:spacing w:val="0"/>
           <w:sz w:val="18"/>
           <w:szCs w:val="18"/>
-          <w:bdr w:val="none" w:color="auto" w:sz="0" w:space="0"/>
           <w:shd w:val="clear" w:fill="FFFFFF"/>
           <w:vertAlign w:val="baseline"/>
         </w:rPr>
@@ -2604,7 +2555,6 @@
           <w:spacing w:val="0"/>
           <w:sz w:val="24"/>
           <w:szCs w:val="24"/>
-          <w:bdr w:val="none" w:color="auto" w:sz="0" w:space="0"/>
           <w:shd w:val="clear" w:fill="FFFFFF"/>
         </w:rPr>
         <w:t> </w:t>
@@ -2619,7 +2569,6 @@
           <w:spacing w:val="0"/>
           <w:sz w:val="24"/>
           <w:szCs w:val="24"/>
-          <w:bdr w:val="none" w:color="auto" w:sz="0" w:space="0"/>
           <w:shd w:val="clear" w:fill="FFFFFF"/>
         </w:rPr>
         <w:t>n</w:t>
@@ -2634,7 +2583,6 @@
           <w:spacing w:val="0"/>
           <w:sz w:val="24"/>
           <w:szCs w:val="24"/>
-          <w:bdr w:val="none" w:color="auto" w:sz="0" w:space="0"/>
           <w:shd w:val="clear" w:fill="FFFFFF"/>
         </w:rPr>
         <w:t>) algorithm ever returns an incorrect answer. Submit one or more examples of the divergence and a few sentences on what may be the cause. </w:t>
@@ -2663,7 +2611,6 @@
           <w:spacing w:val="0"/>
           <w:sz w:val="24"/>
           <w:szCs w:val="24"/>
-          <w:bdr w:val="none" w:color="auto" w:sz="0" w:space="0"/>
           <w:shd w:val="clear" w:fill="FFFFFF"/>
         </w:rPr>
         <w:t>Perform more fine-grained profiling of the FFT-based code to find any bottlenecks (compute/memory/etc). See if you can address some of them, and compare the performance to the original version by plotting your new results as well. Write a few sentences about your findings and (attempted) fixes.</w:t>
@@ -2732,7 +2679,6 @@
           <w:spacing w:val="0"/>
           <w:sz w:val="24"/>
           <w:szCs w:val="24"/>
-          <w:bdr w:val="none" w:color="auto" w:sz="0" w:space="0"/>
           <w:shd w:val="clear" w:fill="FFFFFF"/>
         </w:rPr>
         <w:t>Source code</w:t>
@@ -2761,7 +2707,6 @@
           <w:spacing w:val="0"/>
           <w:sz w:val="24"/>
           <w:szCs w:val="24"/>
-          <w:bdr w:val="none" w:color="auto" w:sz="0" w:space="0"/>
           <w:shd w:val="clear" w:fill="FFFFFF"/>
         </w:rPr>
         <w:t>Log file showing your program runs</w:t>
@@ -2790,7 +2735,6 @@
           <w:spacing w:val="0"/>
           <w:sz w:val="24"/>
           <w:szCs w:val="24"/>
-          <w:bdr w:val="none" w:color="auto" w:sz="0" w:space="0"/>
           <w:shd w:val="clear" w:fill="FFFFFF"/>
         </w:rPr>
         <w:t>Plots based on the provided Excel template, saved as .xlsx or .pdf</w:t>
@@ -2819,7 +2763,6 @@
           <w:spacing w:val="0"/>
           <w:sz w:val="24"/>
           <w:szCs w:val="24"/>
-          <w:bdr w:val="none" w:color="auto" w:sz="0" w:space="0"/>
           <w:shd w:val="clear" w:fill="FFFFFF"/>
         </w:rPr>
         <w:t>Any transcripts/prompts used if generative AI was used</w:t>
@@ -2848,7 +2791,6 @@
           <w:spacing w:val="0"/>
           <w:sz w:val="24"/>
           <w:szCs w:val="24"/>
-          <w:bdr w:val="none" w:color="auto" w:sz="0" w:space="0"/>
           <w:shd w:val="clear" w:fill="FFFFFF"/>
         </w:rPr>
         <w:t>Submit as a .zip file containing all your files</w:t>
@@ -2877,7 +2819,6 @@
           <w:spacing w:val="0"/>
           <w:sz w:val="24"/>
           <w:szCs w:val="24"/>
-          <w:bdr w:val="none" w:color="auto" w:sz="0" w:space="0"/>
           <w:shd w:val="clear" w:fill="FFFFFF"/>
         </w:rPr>
         <w:t>Additionally, please submit the following in the text box on Canvas as part of your submission, with an empty line between each:</w:t>
@@ -2909,7 +2850,6 @@
           <w:spacing w:val="0"/>
           <w:sz w:val="24"/>
           <w:szCs w:val="24"/>
-          <w:bdr w:val="none" w:color="auto" w:sz="0" w:space="0"/>
           <w:shd w:val="clear" w:fill="FFFFFF"/>
         </w:rPr>
         <w:t>Estimate of hours worked on this homework</w:t>
@@ -2941,7 +2881,6 @@
           <w:spacing w:val="0"/>
           <w:sz w:val="24"/>
           <w:szCs w:val="24"/>
-          <w:bdr w:val="none" w:color="auto" w:sz="0" w:space="0"/>
           <w:shd w:val="clear" w:fill="FFFFFF"/>
         </w:rPr>
         <w:t>Which problem you chose for Part 3</w:t>
@@ -2973,7 +2912,6 @@
           <w:spacing w:val="0"/>
           <w:sz w:val="24"/>
           <w:szCs w:val="24"/>
-          <w:bdr w:val="none" w:color="auto" w:sz="0" w:space="0"/>
           <w:shd w:val="clear" w:fill="FFFFFF"/>
         </w:rPr>
         <w:t>Any text answers requested</w:t>
@@ -3005,7 +2943,6 @@
           <w:spacing w:val="0"/>
           <w:sz w:val="24"/>
           <w:szCs w:val="24"/>
-          <w:bdr w:val="none" w:color="auto" w:sz="0" w:space="0"/>
           <w:shd w:val="clear" w:fill="FFFFFF"/>
         </w:rPr>
         <w:t>Concise but clear description of how to run your code, with dependencies included in</w:t>
@@ -3020,7 +2957,6 @@
           <w:spacing w:val="0"/>
           <w:sz w:val="24"/>
           <w:szCs w:val="24"/>
-          <w:bdr w:val="none" w:color="auto" w:sz="0" w:space="0"/>
           <w:shd w:val="clear" w:fill="FFFFFF"/>
         </w:rPr>
         <w:br w:type="textWrapping"/>
@@ -3035,7 +2971,6 @@
           <w:spacing w:val="0"/>
           <w:sz w:val="24"/>
           <w:szCs w:val="24"/>
-          <w:bdr w:val="none" w:color="auto" w:sz="0" w:space="0"/>
           <w:shd w:val="clear" w:fill="FFFFFF"/>
         </w:rPr>
         <w:t>the submission (e.g. pyproject file, cargo.toml, etc.). </w:t>
@@ -3053,7 +2988,6 @@
           <w:spacing w:val="0"/>
           <w:sz w:val="24"/>
           <w:szCs w:val="24"/>
-          <w:bdr w:val="none" w:color="auto" w:sz="0" w:space="0"/>
           <w:shd w:val="clear" w:fill="FFFFFF"/>
         </w:rPr>
         <w:t>If your code doesn’t run following your instructions, we will consider it not submitted!</w:t>
@@ -3121,13 +3055,10 @@
           <w:spacing w:val="0"/>
           <w:sz w:val="24"/>
           <w:szCs w:val="24"/>
-          <w:bdr w:val="none" w:color="auto" w:sz="0" w:space="0"/>
           <w:shd w:val="clear" w:fill="FFFFFF"/>
         </w:rPr>
         <w:t>Lastname-hw1.zip/</w:t>
       </w:r>
-      <w:bookmarkStart w:id="0" w:name="_GoBack"/>
-      <w:bookmarkEnd w:id="0"/>
     </w:p>
     <w:p>
       <w:pPr>
@@ -3155,7 +3086,6 @@
           <w:spacing w:val="0"/>
           <w:sz w:val="24"/>
           <w:szCs w:val="24"/>
-          <w:bdr w:val="none" w:color="auto" w:sz="0" w:space="0"/>
           <w:shd w:val="clear" w:fill="FFFFFF"/>
         </w:rPr>
         <w:t>src/</w:t>
@@ -3187,7 +3117,6 @@
           <w:spacing w:val="0"/>
           <w:sz w:val="24"/>
           <w:szCs w:val="24"/>
-          <w:bdr w:val="none" w:color="auto" w:sz="0" w:space="0"/>
           <w:shd w:val="clear" w:fill="FFFFFF"/>
         </w:rPr>
         <w:t>[code]</w:t>
@@ -3219,7 +3148,6 @@
           <w:spacing w:val="0"/>
           <w:sz w:val="24"/>
           <w:szCs w:val="24"/>
-          <w:bdr w:val="none" w:color="auto" w:sz="0" w:space="0"/>
           <w:shd w:val="clear" w:fill="FFFFFF"/>
         </w:rPr>
         <w:t>runs/</w:t>
@@ -3251,7 +3179,6 @@
           <w:spacing w:val="0"/>
           <w:sz w:val="24"/>
           <w:szCs w:val="24"/>
-          <w:bdr w:val="none" w:color="auto" w:sz="0" w:space="0"/>
           <w:shd w:val="clear" w:fill="FFFFFF"/>
         </w:rPr>
         <w:t>[program outputs as separate .txt files</w:t>
@@ -3283,7 +3210,6 @@
           <w:spacing w:val="0"/>
           <w:sz w:val="24"/>
           <w:szCs w:val="24"/>
-          <w:bdr w:val="none" w:color="auto" w:sz="0" w:space="0"/>
           <w:shd w:val="clear" w:fill="FFFFFF"/>
         </w:rPr>
         <w:t>plots(.xlsx/.pdf</w:t>
@@ -3315,7 +3241,6 @@
           <w:spacing w:val="0"/>
           <w:sz w:val="24"/>
           <w:szCs w:val="24"/>
-          <w:bdr w:val="none" w:color="auto" w:sz="0" w:space="0"/>
           <w:shd w:val="clear" w:fill="FFFFFF"/>
         </w:rPr>
         <w:t>ai/</w:t>
@@ -3347,7 +3272,6 @@
           <w:spacing w:val="0"/>
           <w:sz w:val="24"/>
           <w:szCs w:val="24"/>
-          <w:bdr w:val="none" w:color="auto" w:sz="0" w:space="0"/>
           <w:shd w:val="clear" w:fill="FFFFFF"/>
         </w:rPr>
         <w:t>[transcripts/prompts]</w:t>
@@ -4894,6 +4818,15 @@
     </w:rPr>
   </w:style>
   <w:style w:type="character" w:styleId="7">
+    <w:name w:val="FollowedHyperlink"/>
+    <w:basedOn w:val="5"/>
+    <w:uiPriority w:val="0"/>
+    <w:rPr>
+      <w:color w:val="800080"/>
+      <w:u w:val="single"/>
+    </w:rPr>
+  </w:style>
+  <w:style w:type="character" w:styleId="8">
     <w:name w:val="Hyperlink"/>
     <w:basedOn w:val="5"/>
     <w:uiPriority w:val="0"/>
@@ -4902,7 +4835,7 @@
       <w:u w:val="single"/>
     </w:rPr>
   </w:style>
-  <w:style w:type="character" w:styleId="8">
+  <w:style w:type="character" w:styleId="9">
     <w:name w:val="HTML Code"/>
     <w:basedOn w:val="5"/>
     <w:uiPriority w:val="0"/>

</xml_diff>